<commit_message>
CS699 Homework 7 Correction
</commit_message>
<xml_diff>
--- a/BU/CS699/hw7/Rissman_Joseph_hw7.docx
+++ b/BU/CS699/hw7/Rissman_Joseph_hw7.docx
@@ -556,10 +556,7 @@
     <w:p/>
     <w:p>
       <w:r>
-        <w:t>L</w:t>
-      </w:r>
-      <w:r>
-        <w:t>2:</w:t>
+        <w:t>L2:</w:t>
       </w:r>
     </w:p>
     <w:tbl>
@@ -875,10 +872,7 @@
     <w:p/>
     <w:p>
       <w:r>
-        <w:t>C3</w:t>
-      </w:r>
-      <w:r>
-        <w:t>:</w:t>
+        <w:t>C3:</w:t>
       </w:r>
     </w:p>
     <w:tbl>
@@ -927,10 +921,7 @@
               <w:t>1</w:t>
             </w:r>
             <w:r>
-              <w:t>,2</w:t>
-            </w:r>
-            <w:r>
-              <w:t>,4</w:t>
+              <w:t>,2,4</w:t>
             </w:r>
           </w:p>
         </w:tc>
@@ -1201,10 +1192,7 @@
     <w:p/>
     <w:p>
       <w:r>
-        <w:t>L</w:t>
-      </w:r>
-      <w:r>
-        <w:t>3:</w:t>
+        <w:t>L3:</w:t>
       </w:r>
     </w:p>
     <w:tbl>
@@ -1433,10 +1421,7 @@
     <w:p/>
     <w:p>
       <w:r>
-        <w:t>C4</w:t>
-      </w:r>
-      <w:r>
-        <w:t>:</w:t>
+        <w:t>C4:</w:t>
       </w:r>
     </w:p>
     <w:tbl>
@@ -1518,10 +1503,7 @@
     <w:p/>
     <w:p>
       <w:r>
-        <w:t>L</w:t>
-      </w:r>
-      <w:r>
-        <w:t>4:</w:t>
+        <w:t>L4:</w:t>
       </w:r>
     </w:p>
     <w:tbl>
@@ -1603,10 +1585,7 @@
     <w:p/>
     <w:p>
       <w:r>
-        <w:t>C</w:t>
-      </w:r>
-      <w:r>
-        <w:t>5 is empty.</w:t>
+        <w:t>C5 is empty.</w:t>
       </w:r>
     </w:p>
     <w:p/>
@@ -1637,35 +1616,7 @@
       </w:r>
       <w:r>
         <w:tab/>
-      </w:r>
-      <w:r>
-        <w:t>conf(R1) = (</w:t>
-      </w:r>
-      <w:proofErr w:type="gramStart"/>
-      <w:r>
-        <w:t>sup(</w:t>
-      </w:r>
-      <w:proofErr w:type="gramEnd"/>
-      <w:r>
-        <w:t>{</w:t>
-      </w:r>
-      <w:r>
-        <w:t>1</w:t>
-      </w:r>
-      <w:r>
-        <w:t>,</w:t>
-      </w:r>
-      <w:r>
-        <w:t>4</w:t>
-      </w:r>
-      <w:r>
-        <w:t>,</w:t>
-      </w:r>
-      <w:r>
-        <w:t>5,7</w:t>
-      </w:r>
-      <w:r>
-        <w:t>})) / sup({</w:t>
+        <w:t>conf(R1) = (sup({1,4,5,7})) / sup({</w:t>
       </w:r>
       <w:r>
         <w:t>1,4</w:t>
@@ -1694,19 +1645,7 @@
     </w:p>
     <w:p>
       <w:r>
-        <w:t>R</w:t>
-      </w:r>
-      <w:r>
-        <w:t>2</w:t>
-      </w:r>
-      <w:r>
-        <w:t>: {1,</w:t>
-      </w:r>
-      <w:r>
-        <w:t>5</w:t>
-      </w:r>
-      <w:r>
-        <w:t xml:space="preserve">} </w:t>
+        <w:t xml:space="preserve">R2: {1,5} </w:t>
       </w:r>
       <w:r>
         <w:rPr>
@@ -1715,49 +1654,17 @@
         <w:t>→</w:t>
       </w:r>
       <w:r>
-        <w:t xml:space="preserve"> {</w:t>
-      </w:r>
-      <w:r>
-        <w:t>4</w:t>
-      </w:r>
-      <w:r>
-        <w:t>,7}</w:t>
+        <w:t xml:space="preserve"> {4,7}</w:t>
       </w:r>
       <w:r>
         <w:t xml:space="preserve"> </w:t>
       </w:r>
       <w:r>
         <w:tab/>
-        <w:t>conf(R</w:t>
-      </w:r>
-      <w:r>
-        <w:t>2</w:t>
-      </w:r>
-      <w:r>
-        <w:t>) = (</w:t>
-      </w:r>
-      <w:proofErr w:type="gramStart"/>
-      <w:r>
-        <w:t>sup(</w:t>
-      </w:r>
-      <w:proofErr w:type="gramEnd"/>
-      <w:r>
-        <w:t>{1,4,5,7})) / sup({1,</w:t>
-      </w:r>
-      <w:r>
-        <w:t>5</w:t>
-      </w:r>
-      <w:r>
-        <w:t>}) = </w:t>
-      </w:r>
-      <w:r>
-        <w:t>2/</w:t>
-      </w:r>
-      <w:r>
-        <w:t>2</w:t>
-      </w:r>
-      <w:r>
-        <w:t> = 100%</w:t>
+        <w:t>conf(R2) = (sup({1,4,5,7})) / sup({1,5}) = 2/</w:t>
+      </w:r>
+      <w:r>
+        <w:t>2 = 100%</w:t>
       </w:r>
     </w:p>
     <w:p>
@@ -1768,13 +1675,7 @@
         <w:t>3</w:t>
       </w:r>
       <w:r>
-        <w:t>: {1,</w:t>
-      </w:r>
-      <w:r>
-        <w:t>7</w:t>
-      </w:r>
-      <w:r>
-        <w:t xml:space="preserve">} </w:t>
+        <w:t xml:space="preserve">: {1,7} </w:t>
       </w:r>
       <w:r>
         <w:rPr>
@@ -1783,49 +1684,17 @@
         <w:t>→</w:t>
       </w:r>
       <w:r>
-        <w:t xml:space="preserve"> {</w:t>
-      </w:r>
-      <w:r>
-        <w:t>4,5</w:t>
-      </w:r>
-      <w:r>
-        <w:t>}</w:t>
+        <w:t xml:space="preserve"> {4,5}</w:t>
       </w:r>
       <w:r>
         <w:t xml:space="preserve"> </w:t>
       </w:r>
       <w:r>
         <w:tab/>
-        <w:t>conf(R</w:t>
-      </w:r>
-      <w:r>
-        <w:t>3</w:t>
-      </w:r>
-      <w:r>
-        <w:t>) = (</w:t>
-      </w:r>
-      <w:proofErr w:type="gramStart"/>
-      <w:r>
-        <w:t>sup(</w:t>
-      </w:r>
-      <w:proofErr w:type="gramEnd"/>
-      <w:r>
-        <w:t>{1,4,5,7})) / sup({1,</w:t>
-      </w:r>
-      <w:r>
-        <w:t>7</w:t>
-      </w:r>
-      <w:r>
-        <w:t>}) = </w:t>
-      </w:r>
-      <w:r>
-        <w:t>2/</w:t>
-      </w:r>
-      <w:r>
-        <w:t>2</w:t>
-      </w:r>
-      <w:r>
-        <w:t> = 100%</w:t>
+        <w:t>conf(R3) = (sup({1,4,5,7})) / sup({1,7}) = 2/</w:t>
+      </w:r>
+      <w:r>
+        <w:t>2 = 100%</w:t>
       </w:r>
     </w:p>
     <w:p>
@@ -1864,42 +1733,10 @@
       </w:r>
       <w:r>
         <w:tab/>
-        <w:t>conf(R</w:t>
-      </w:r>
-      <w:r>
-        <w:t>4</w:t>
-      </w:r>
-      <w:r>
-        <w:t>) = (</w:t>
-      </w:r>
-      <w:proofErr w:type="gramStart"/>
-      <w:r>
-        <w:t>sup(</w:t>
-      </w:r>
-      <w:proofErr w:type="gramEnd"/>
-      <w:r>
-        <w:t>{1,4,5,7})) / sup({</w:t>
-      </w:r>
-      <w:r>
-        <w:t>4,5</w:t>
-      </w:r>
-      <w:r>
-        <w:t>}) = </w:t>
-      </w:r>
-      <w:r>
-        <w:t>2/</w:t>
-      </w:r>
-      <w:r>
-        <w:t>4</w:t>
-      </w:r>
-      <w:r>
-        <w:t> = </w:t>
-      </w:r>
-      <w:r>
-        <w:t>5</w:t>
-      </w:r>
-      <w:r>
-        <w:t>0%</w:t>
+        <w:t>conf(R4) = (sup({1,4,5,7})) / sup({4,5}) = 2/</w:t>
+      </w:r>
+      <w:r>
+        <w:t>4 = 50%</w:t>
       </w:r>
     </w:p>
     <w:p>
@@ -1938,36 +1775,10 @@
       </w:r>
       <w:r>
         <w:tab/>
-        <w:t>conf(R</w:t>
-      </w:r>
-      <w:r>
-        <w:t>5</w:t>
-      </w:r>
-      <w:r>
-        <w:t>) = (</w:t>
-      </w:r>
-      <w:proofErr w:type="gramStart"/>
-      <w:r>
-        <w:t>sup(</w:t>
-      </w:r>
-      <w:proofErr w:type="gramEnd"/>
-      <w:r>
-        <w:t>{1,4,5,7})) / sup({</w:t>
-      </w:r>
-      <w:r>
-        <w:t>4,7</w:t>
-      </w:r>
-      <w:r>
-        <w:t>}) = </w:t>
-      </w:r>
-      <w:r>
-        <w:t>2/</w:t>
-      </w:r>
-      <w:r>
-        <w:t>2</w:t>
-      </w:r>
-      <w:r>
-        <w:t> = 100%</w:t>
+        <w:t>conf(R5) = (sup({1,4,5,7})) / sup({4,7}) = 2/</w:t>
+      </w:r>
+      <w:r>
+        <w:t>2 = 100%</w:t>
       </w:r>
     </w:p>
     <w:p>
@@ -2006,36 +1817,10 @@
       </w:r>
       <w:r>
         <w:tab/>
-        <w:t>conf(R</w:t>
-      </w:r>
-      <w:r>
-        <w:t>6</w:t>
-      </w:r>
-      <w:r>
-        <w:t>) = (</w:t>
-      </w:r>
-      <w:proofErr w:type="gramStart"/>
-      <w:r>
-        <w:t>sup(</w:t>
-      </w:r>
-      <w:proofErr w:type="gramEnd"/>
-      <w:r>
-        <w:t>{1,4,5,7})) / sup({</w:t>
-      </w:r>
-      <w:r>
-        <w:t>5,7</w:t>
-      </w:r>
-      <w:r>
-        <w:t>}) = </w:t>
-      </w:r>
-      <w:r>
-        <w:t>2/</w:t>
-      </w:r>
-      <w:r>
-        <w:t>2</w:t>
-      </w:r>
-      <w:r>
-        <w:t> = 100%</w:t>
+        <w:t>conf(R6) = (sup({1,4,5,7})) / sup({5,7}) = 2/</w:t>
+      </w:r>
+      <w:r>
+        <w:t>2 = 100%</w:t>
       </w:r>
     </w:p>
     <w:p>
@@ -2099,6 +1884,9 @@
     </w:p>
     <w:p>
       <w:r>
+        <w:rPr>
+          <w:noProof/>
+        </w:rPr>
         <w:drawing>
           <wp:inline distT="0" distB="0" distL="0" distR="0" wp14:anchorId="09768B9A" wp14:editId="3552BFC8">
             <wp:extent cx="5943600" cy="4451623"/>
@@ -2149,19 +1937,17 @@
         <w:t xml:space="preserve">(2). </w:t>
       </w:r>
       <w:r>
-        <w:t xml:space="preserve">41 total frequent </w:t>
-      </w:r>
-      <w:proofErr w:type="spellStart"/>
-      <w:r>
-        <w:t>itemsets</w:t>
-      </w:r>
-      <w:proofErr w:type="spellEnd"/>
+        <w:t>41 total frequent itemsets</w:t>
+      </w:r>
       <w:r>
         <w:t>.</w:t>
       </w:r>
     </w:p>
     <w:p>
       <w:r>
+        <w:rPr>
+          <w:noProof/>
+        </w:rPr>
         <w:drawing>
           <wp:inline distT="0" distB="0" distL="0" distR="0" wp14:anchorId="6B468F68" wp14:editId="17CCE0E6">
             <wp:extent cx="4367986" cy="914400"/>
@@ -2220,10 +2006,57 @@
     <w:p>
       <w:r>
         <w:drawing>
-          <wp:inline distT="0" distB="0" distL="0" distR="0" wp14:anchorId="10DAC9E2" wp14:editId="334F773B">
-            <wp:extent cx="3485120" cy="914400"/>
-            <wp:effectExtent l="0" t="0" r="1270" b="0"/>
-            <wp:docPr id="4" name="Picture 4"/>
+          <wp:inline distT="0" distB="0" distL="0" distR="0" wp14:anchorId="5CEDE3A3" wp14:editId="7DDC6CD1">
+            <wp:extent cx="2971799" cy="914400"/>
+            <wp:effectExtent l="0" t="0" r="635" b="0"/>
+            <wp:docPr id="2" name="Picture 2"/>
+            <wp:cNvGraphicFramePr>
+              <a:graphicFrameLocks xmlns:a="http://schemas.openxmlformats.org/drawingml/2006/main" noChangeAspect="1"/>
+            </wp:cNvGraphicFramePr>
+            <a:graphic xmlns:a="http://schemas.openxmlformats.org/drawingml/2006/main">
+              <a:graphicData uri="http://schemas.openxmlformats.org/drawingml/2006/picture">
+                <pic:pic xmlns:pic="http://schemas.openxmlformats.org/drawingml/2006/picture">
+                  <pic:nvPicPr>
+                    <pic:cNvPr id="1" name=""/>
+                    <pic:cNvPicPr/>
+                  </pic:nvPicPr>
+                  <pic:blipFill>
+                    <a:blip r:embed="rId6"/>
+                    <a:stretch>
+                      <a:fillRect/>
+                    </a:stretch>
+                  </pic:blipFill>
+                  <pic:spPr>
+                    <a:xfrm>
+                      <a:off x="0" y="0"/>
+                      <a:ext cx="2971799" cy="914400"/>
+                    </a:xfrm>
+                    <a:prstGeom prst="rect">
+                      <a:avLst/>
+                    </a:prstGeom>
+                  </pic:spPr>
+                </pic:pic>
+              </a:graphicData>
+            </a:graphic>
+          </wp:inline>
+        </w:drawing>
+      </w:r>
+    </w:p>
+    <w:p>
+      <w:r>
+        <w:t xml:space="preserve">(4). </w:t>
+      </w:r>
+      <w:r>
+        <w:t>10 total frequent 2-itemsets.</w:t>
+      </w:r>
+    </w:p>
+    <w:p>
+      <w:r>
+        <w:drawing>
+          <wp:inline distT="0" distB="0" distL="0" distR="0" wp14:anchorId="6B1E5AE4" wp14:editId="62764CBD">
+            <wp:extent cx="3892969" cy="914400"/>
+            <wp:effectExtent l="0" t="0" r="0" b="0"/>
+            <wp:docPr id="11" name="Picture 11"/>
             <wp:cNvGraphicFramePr>
               <a:graphicFrameLocks xmlns:a="http://schemas.openxmlformats.org/drawingml/2006/main" noChangeAspect="1"/>
             </wp:cNvGraphicFramePr>
@@ -2235,14 +2068,14 @@
                     <pic:cNvPicPr/>
                   </pic:nvPicPr>
                   <pic:blipFill rotWithShape="1">
-                    <a:blip r:embed="rId6"/>
-                    <a:srcRect t="2447"/>
+                    <a:blip r:embed="rId7"/>
+                    <a:srcRect t="1789"/>
                     <a:stretch/>
                   </pic:blipFill>
                   <pic:spPr bwMode="auto">
                     <a:xfrm>
                       <a:off x="0" y="0"/>
-                      <a:ext cx="3485120" cy="914400"/>
+                      <a:ext cx="3892969" cy="914400"/>
                     </a:xfrm>
                     <a:prstGeom prst="rect">
                       <a:avLst/>
@@ -2265,60 +2098,6 @@
     </w:p>
     <w:p>
       <w:r>
-        <w:t xml:space="preserve">(4). </w:t>
-      </w:r>
-      <w:r>
-        <w:t>10 total frequent 2-itemsets.</w:t>
-      </w:r>
-    </w:p>
-    <w:p>
-      <w:r>
-        <w:drawing>
-          <wp:inline distT="0" distB="0" distL="0" distR="0" wp14:anchorId="6B07004E" wp14:editId="3E27D4D3">
-            <wp:extent cx="4361826" cy="914400"/>
-            <wp:effectExtent l="0" t="0" r="635" b="0"/>
-            <wp:docPr id="5" name="Picture 5"/>
-            <wp:cNvGraphicFramePr>
-              <a:graphicFrameLocks xmlns:a="http://schemas.openxmlformats.org/drawingml/2006/main" noChangeAspect="1"/>
-            </wp:cNvGraphicFramePr>
-            <a:graphic xmlns:a="http://schemas.openxmlformats.org/drawingml/2006/main">
-              <a:graphicData uri="http://schemas.openxmlformats.org/drawingml/2006/picture">
-                <pic:pic xmlns:pic="http://schemas.openxmlformats.org/drawingml/2006/picture">
-                  <pic:nvPicPr>
-                    <pic:cNvPr id="1" name=""/>
-                    <pic:cNvPicPr/>
-                  </pic:nvPicPr>
-                  <pic:blipFill rotWithShape="1">
-                    <a:blip r:embed="rId7"/>
-                    <a:srcRect t="3149" b="-1"/>
-                    <a:stretch/>
-                  </pic:blipFill>
-                  <pic:spPr bwMode="auto">
-                    <a:xfrm>
-                      <a:off x="0" y="0"/>
-                      <a:ext cx="4361826" cy="914400"/>
-                    </a:xfrm>
-                    <a:prstGeom prst="rect">
-                      <a:avLst/>
-                    </a:prstGeom>
-                    <a:ln>
-                      <a:noFill/>
-                    </a:ln>
-                    <a:extLst>
-                      <a:ext uri="{53640926-AAD7-44D8-BBD7-CCE9431645EC}">
-                        <a14:shadowObscured xmlns:a14="http://schemas.microsoft.com/office/drawing/2010/main"/>
-                      </a:ext>
-                    </a:extLst>
-                  </pic:spPr>
-                </pic:pic>
-              </a:graphicData>
-            </a:graphic>
-          </wp:inline>
-        </w:drawing>
-      </w:r>
-    </w:p>
-    <w:p>
-      <w:r>
         <w:t xml:space="preserve">(5). </w:t>
       </w:r>
       <w:r>
@@ -2343,6 +2122,9 @@
         <w:t xml:space="preserve"> </w:t>
       </w:r>
       <w:r>
+        <w:rPr>
+          <w:noProof/>
+        </w:rPr>
         <w:drawing>
           <wp:inline distT="0" distB="0" distL="0" distR="0" wp14:anchorId="59CF0EBF" wp14:editId="039289B6">
             <wp:extent cx="5719762" cy="3246698"/>
@@ -2389,6 +2171,9 @@
         <w:t xml:space="preserve">(8). </w:t>
       </w:r>
       <w:r>
+        <w:rPr>
+          <w:noProof/>
+        </w:rPr>
         <w:drawing>
           <wp:inline distT="0" distB="0" distL="0" distR="0" wp14:anchorId="77E3032B" wp14:editId="51853C99">
             <wp:extent cx="6010382" cy="914400"/>
@@ -2437,6 +2222,9 @@
         <w:t xml:space="preserve"> </w:t>
       </w:r>
       <w:r>
+        <w:rPr>
+          <w:noProof/>
+        </w:rPr>
         <w:drawing>
           <wp:inline distT="0" distB="0" distL="0" distR="0" wp14:anchorId="2B36AF20" wp14:editId="5D8EAAF7">
             <wp:extent cx="5019815" cy="914400"/>
@@ -2479,13 +2267,8 @@
         <w:t xml:space="preserve">(10). </w:t>
       </w:r>
       <w:r>
-        <w:t xml:space="preserve">See next </w:t>
-      </w:r>
-      <w:proofErr w:type="gramStart"/>
-      <w:r>
-        <w:t>page</w:t>
-      </w:r>
-      <w:proofErr w:type="gramEnd"/>
+        <w:t>See next page</w:t>
+      </w:r>
     </w:p>
     <w:p>
       <w:r>
@@ -2498,6 +2281,9 @@
         <w:spacing w:after="0"/>
       </w:pPr>
       <w:r>
+        <w:rPr>
+          <w:noProof/>
+        </w:rPr>
         <w:drawing>
           <wp:inline distT="0" distB="0" distL="0" distR="0" wp14:anchorId="767F2C63" wp14:editId="19953168">
             <wp:extent cx="5943600" cy="3470656"/>
@@ -2544,6 +2330,9 @@
     </w:p>
     <w:p>
       <w:r>
+        <w:rPr>
+          <w:noProof/>
+        </w:rPr>
         <w:drawing>
           <wp:inline distT="0" distB="0" distL="0" distR="0" wp14:anchorId="17F67A35" wp14:editId="3BE7B2D7">
             <wp:extent cx="5916168" cy="2684994"/>

</xml_diff>